<commit_message>
First amendment to the articles of incorporation
The first amendment to the articles of incorporation was carried out; the company details and the version history were updated.
</commit_message>
<xml_diff>
--- a/Acta de Constitución - modulo 2.docx
+++ b/Acta de Constitución - modulo 2.docx
@@ -213,7 +213,7 @@
           <w:sz w:val="44"/>
           <w:szCs w:val="44"/>
         </w:rPr>
-        <w:t>Mercado Libre</w:t>
+        <w:t>Marketplace</w:t>
       </w:r>
       <w:r>
         <w:rPr>
@@ -224,7 +224,18 @@
           <w:sz w:val="44"/>
           <w:szCs w:val="44"/>
         </w:rPr>
-        <w:t xml:space="preserve"> – Simulador de Plataforma de Comercio Electrónico</w:t>
+        <w:t xml:space="preserve"> – Simulador de Plataforma de </w:t>
+      </w:r>
+      <w:r>
+        <w:rPr>
+          <w:rFonts w:ascii="Calibri" w:hAnsi="Calibri"/>
+          <w:b/>
+          <w:i/>
+          <w:color w:val="A8D08D" w:themeColor="accent6" w:themeTint="99"/>
+          <w:sz w:val="44"/>
+          <w:szCs w:val="44"/>
+        </w:rPr>
+        <w:t>viajes Online</w:t>
       </w:r>
     </w:p>
     <w:p>
@@ -267,7 +278,37 @@
           <w:sz w:val="36"/>
           <w:szCs w:val="36"/>
         </w:rPr>
-        <w:t>07/08/2026</w:t>
+        <w:t>18</w:t>
+      </w:r>
+      <w:r>
+        <w:rPr>
+          <w:b/>
+          <w:i/>
+          <w:color w:val="A8D08D" w:themeColor="accent6" w:themeTint="99"/>
+          <w:sz w:val="36"/>
+          <w:szCs w:val="36"/>
+        </w:rPr>
+        <w:t>/0</w:t>
+      </w:r>
+      <w:r>
+        <w:rPr>
+          <w:b/>
+          <w:i/>
+          <w:color w:val="A8D08D" w:themeColor="accent6" w:themeTint="99"/>
+          <w:sz w:val="36"/>
+          <w:szCs w:val="36"/>
+        </w:rPr>
+        <w:t>9</w:t>
+      </w:r>
+      <w:r>
+        <w:rPr>
+          <w:b/>
+          <w:i/>
+          <w:color w:val="A8D08D" w:themeColor="accent6" w:themeTint="99"/>
+          <w:sz w:val="36"/>
+          <w:szCs w:val="36"/>
+        </w:rPr>
+        <w:t>/2026</w:t>
       </w:r>
     </w:p>
     <w:p>
@@ -1787,6 +1828,7 @@
         <w:rPr>
           <w:noProof/>
         </w:rPr>
+        <w:lastRenderedPageBreak/>
         <w:t>Aprobaciones</w:t>
       </w:r>
       <w:r>
@@ -1850,7 +1892,6 @@
           <w:szCs w:val="24"/>
           <w:lang w:eastAsia="es-VE"/>
         </w:rPr>
-        <w:lastRenderedPageBreak/>
         <w:fldChar w:fldCharType="end"/>
       </w:r>
     </w:p>
@@ -2092,18 +2133,9 @@
                 <w:szCs w:val="20"/>
                 <w:lang w:eastAsia="es-VE"/>
               </w:rPr>
-              <w:t>06/09/2026</w:t>
-            </w:r>
-          </w:p>
-        </w:tc>
-        <w:tc>
-          <w:tcPr>
-            <w:tcW w:w="950" w:type="dxa"/>
-          </w:tcPr>
-          <w:p>
-            <w:pPr>
-              <w:spacing w:after="0" w:line="240" w:lineRule="auto"/>
-              <w:jc w:val="center"/>
+              <w:t>18</w:t>
+            </w:r>
+            <w:r>
               <w:rPr>
                 <w:rFonts w:eastAsia="Times New Roman" w:cs="Arial"/>
                 <w:bCs/>
@@ -2112,8 +2144,18 @@
                 <w:szCs w:val="20"/>
                 <w:lang w:eastAsia="es-VE"/>
               </w:rPr>
-            </w:pPr>
-            <w:r>
+              <w:t>/09/2026</w:t>
+            </w:r>
+          </w:p>
+        </w:tc>
+        <w:tc>
+          <w:tcPr>
+            <w:tcW w:w="950" w:type="dxa"/>
+          </w:tcPr>
+          <w:p>
+            <w:pPr>
+              <w:spacing w:after="0" w:line="240" w:lineRule="auto"/>
+              <w:jc w:val="center"/>
               <w:rPr>
                 <w:rFonts w:eastAsia="Times New Roman" w:cs="Arial"/>
                 <w:bCs/>
@@ -2122,18 +2164,8 @@
                 <w:szCs w:val="20"/>
                 <w:lang w:eastAsia="es-VE"/>
               </w:rPr>
-              <w:t>1</w:t>
-            </w:r>
-          </w:p>
-        </w:tc>
-        <w:tc>
-          <w:tcPr>
-            <w:tcW w:w="1628" w:type="dxa"/>
-          </w:tcPr>
-          <w:p>
-            <w:pPr>
-              <w:spacing w:after="0" w:line="240" w:lineRule="auto"/>
-              <w:jc w:val="center"/>
+            </w:pPr>
+            <w:r>
               <w:rPr>
                 <w:rFonts w:eastAsia="Times New Roman" w:cs="Arial"/>
                 <w:bCs/>
@@ -2142,8 +2174,18 @@
                 <w:szCs w:val="20"/>
                 <w:lang w:eastAsia="es-VE"/>
               </w:rPr>
-            </w:pPr>
-            <w:r>
+              <w:t>1</w:t>
+            </w:r>
+          </w:p>
+        </w:tc>
+        <w:tc>
+          <w:tcPr>
+            <w:tcW w:w="1628" w:type="dxa"/>
+          </w:tcPr>
+          <w:p>
+            <w:pPr>
+              <w:spacing w:after="0" w:line="240" w:lineRule="auto"/>
+              <w:jc w:val="center"/>
               <w:rPr>
                 <w:rFonts w:eastAsia="Times New Roman" w:cs="Arial"/>
                 <w:bCs/>
@@ -2152,18 +2194,8 @@
                 <w:szCs w:val="20"/>
                 <w:lang w:eastAsia="es-VE"/>
               </w:rPr>
-              <w:t>Equipo 2</w:t>
-            </w:r>
-          </w:p>
-        </w:tc>
-        <w:tc>
-          <w:tcPr>
-            <w:tcW w:w="1683" w:type="dxa"/>
-          </w:tcPr>
-          <w:p>
-            <w:pPr>
-              <w:spacing w:after="0" w:line="240" w:lineRule="auto"/>
-              <w:jc w:val="center"/>
+            </w:pPr>
+            <w:r>
               <w:rPr>
                 <w:rFonts w:eastAsia="Times New Roman" w:cs="Arial"/>
                 <w:bCs/>
@@ -2172,8 +2204,18 @@
                 <w:szCs w:val="20"/>
                 <w:lang w:eastAsia="es-VE"/>
               </w:rPr>
-            </w:pPr>
-            <w:r>
+              <w:t>Samuel Aguilar</w:t>
+            </w:r>
+          </w:p>
+        </w:tc>
+        <w:tc>
+          <w:tcPr>
+            <w:tcW w:w="1683" w:type="dxa"/>
+          </w:tcPr>
+          <w:p>
+            <w:pPr>
+              <w:spacing w:after="0" w:line="240" w:lineRule="auto"/>
+              <w:jc w:val="center"/>
               <w:rPr>
                 <w:rFonts w:eastAsia="Times New Roman" w:cs="Arial"/>
                 <w:bCs/>
@@ -2182,18 +2224,8 @@
                 <w:szCs w:val="20"/>
                 <w:lang w:eastAsia="es-VE"/>
               </w:rPr>
-              <w:t>Universidad El Bosque</w:t>
-            </w:r>
-          </w:p>
-        </w:tc>
-        <w:tc>
-          <w:tcPr>
-            <w:tcW w:w="3041" w:type="dxa"/>
-          </w:tcPr>
-          <w:p>
-            <w:pPr>
-              <w:spacing w:after="0" w:line="240" w:lineRule="auto"/>
-              <w:jc w:val="both"/>
+            </w:pPr>
+            <w:r>
               <w:rPr>
                 <w:rFonts w:eastAsia="Times New Roman" w:cs="Arial"/>
                 <w:bCs/>
@@ -2202,8 +2234,18 @@
                 <w:szCs w:val="20"/>
                 <w:lang w:eastAsia="es-VE"/>
               </w:rPr>
-            </w:pPr>
-            <w:r>
+              <w:t>Universidad El Bosque</w:t>
+            </w:r>
+          </w:p>
+        </w:tc>
+        <w:tc>
+          <w:tcPr>
+            <w:tcW w:w="3041" w:type="dxa"/>
+          </w:tcPr>
+          <w:p>
+            <w:pPr>
+              <w:spacing w:after="0" w:line="240" w:lineRule="auto"/>
+              <w:jc w:val="both"/>
               <w:rPr>
                 <w:rFonts w:eastAsia="Times New Roman" w:cs="Arial"/>
                 <w:bCs/>
@@ -2212,7 +2254,17 @@
                 <w:szCs w:val="20"/>
                 <w:lang w:eastAsia="es-VE"/>
               </w:rPr>
-              <w:t>Versión inicial del acta de constitución, se procede a la elaboración del documento, tomando las especificaciones y requerimientos definidos por el cliente y patrocinador</w:t>
+            </w:pPr>
+            <w:r>
+              <w:rPr>
+                <w:rFonts w:eastAsia="Times New Roman" w:cs="Arial"/>
+                <w:bCs/>
+                <w:color w:val="000000"/>
+                <w:sz w:val="20"/>
+                <w:szCs w:val="20"/>
+                <w:lang w:eastAsia="es-VE"/>
+              </w:rPr>
+              <w:t>Versión inicial del documento, utilizando la plantilla proporcionada por la universidad El Bosque, este documento será subido a un repositorio de GitHub para su posterior modificación por el equipo.</w:t>
             </w:r>
           </w:p>
         </w:tc>
@@ -2225,7 +2277,6 @@
           <w:p>
             <w:pPr>
               <w:spacing w:after="0" w:line="240" w:lineRule="auto"/>
-              <w:jc w:val="center"/>
               <w:rPr>
                 <w:rFonts w:eastAsia="Times New Roman" w:cs="Arial"/>
                 <w:bCs/>
@@ -2235,7 +2286,15 @@
                 <w:lang w:eastAsia="es-VE"/>
               </w:rPr>
             </w:pPr>
-            <w:r>
+          </w:p>
+        </w:tc>
+        <w:tc>
+          <w:tcPr>
+            <w:tcW w:w="950" w:type="dxa"/>
+          </w:tcPr>
+          <w:p>
+            <w:pPr>
+              <w:spacing w:after="0" w:line="240" w:lineRule="auto"/>
               <w:rPr>
                 <w:rFonts w:eastAsia="Times New Roman" w:cs="Arial"/>
                 <w:bCs/>
@@ -2244,18 +2303,16 @@
                 <w:szCs w:val="20"/>
                 <w:lang w:eastAsia="es-VE"/>
               </w:rPr>
-              <w:t>07/09/2026</w:t>
-            </w:r>
-          </w:p>
-        </w:tc>
-        <w:tc>
-          <w:tcPr>
-            <w:tcW w:w="950" w:type="dxa"/>
-          </w:tcPr>
-          <w:p>
-            <w:pPr>
-              <w:spacing w:after="0" w:line="240" w:lineRule="auto"/>
-              <w:jc w:val="center"/>
+            </w:pPr>
+          </w:p>
+        </w:tc>
+        <w:tc>
+          <w:tcPr>
+            <w:tcW w:w="1628" w:type="dxa"/>
+          </w:tcPr>
+          <w:p>
+            <w:pPr>
+              <w:spacing w:after="0" w:line="240" w:lineRule="auto"/>
               <w:rPr>
                 <w:rFonts w:eastAsia="Times New Roman" w:cs="Arial"/>
                 <w:bCs/>
@@ -2265,7 +2322,15 @@
                 <w:lang w:eastAsia="es-VE"/>
               </w:rPr>
             </w:pPr>
-            <w:r>
+          </w:p>
+        </w:tc>
+        <w:tc>
+          <w:tcPr>
+            <w:tcW w:w="1683" w:type="dxa"/>
+          </w:tcPr>
+          <w:p>
+            <w:pPr>
+              <w:spacing w:after="0" w:line="240" w:lineRule="auto"/>
               <w:rPr>
                 <w:rFonts w:eastAsia="Times New Roman" w:cs="Arial"/>
                 <w:bCs/>
@@ -2274,18 +2339,16 @@
                 <w:szCs w:val="20"/>
                 <w:lang w:eastAsia="es-VE"/>
               </w:rPr>
-              <w:t>1.1</w:t>
-            </w:r>
-          </w:p>
-        </w:tc>
-        <w:tc>
-          <w:tcPr>
-            <w:tcW w:w="1628" w:type="dxa"/>
-          </w:tcPr>
-          <w:p>
-            <w:pPr>
-              <w:spacing w:after="0" w:line="240" w:lineRule="auto"/>
-              <w:jc w:val="center"/>
+            </w:pPr>
+          </w:p>
+        </w:tc>
+        <w:tc>
+          <w:tcPr>
+            <w:tcW w:w="3041" w:type="dxa"/>
+          </w:tcPr>
+          <w:p>
+            <w:pPr>
+              <w:spacing w:after="0" w:line="240" w:lineRule="auto"/>
               <w:rPr>
                 <w:rFonts w:eastAsia="Times New Roman" w:cs="Arial"/>
                 <w:bCs/>
@@ -2295,110 +2358,6 @@
                 <w:lang w:eastAsia="es-VE"/>
               </w:rPr>
             </w:pPr>
-            <w:r>
-              <w:rPr>
-                <w:rFonts w:eastAsia="Times New Roman" w:cs="Arial"/>
-                <w:bCs/>
-                <w:color w:val="000000"/>
-                <w:sz w:val="20"/>
-                <w:szCs w:val="20"/>
-                <w:lang w:eastAsia="es-VE"/>
-              </w:rPr>
-              <w:t>Equipo 2</w:t>
-            </w:r>
-          </w:p>
-        </w:tc>
-        <w:tc>
-          <w:tcPr>
-            <w:tcW w:w="1683" w:type="dxa"/>
-          </w:tcPr>
-          <w:p>
-            <w:pPr>
-              <w:spacing w:after="0" w:line="240" w:lineRule="auto"/>
-              <w:jc w:val="center"/>
-              <w:rPr>
-                <w:rFonts w:eastAsia="Times New Roman" w:cs="Arial"/>
-                <w:bCs/>
-                <w:color w:val="000000"/>
-                <w:sz w:val="20"/>
-                <w:szCs w:val="20"/>
-                <w:lang w:eastAsia="es-VE"/>
-              </w:rPr>
-            </w:pPr>
-            <w:r>
-              <w:rPr>
-                <w:rFonts w:eastAsia="Times New Roman" w:cs="Arial"/>
-                <w:bCs/>
-                <w:color w:val="000000"/>
-                <w:sz w:val="20"/>
-                <w:szCs w:val="20"/>
-                <w:lang w:eastAsia="es-VE"/>
-              </w:rPr>
-              <w:t>Universidad El Bosque</w:t>
-            </w:r>
-          </w:p>
-        </w:tc>
-        <w:tc>
-          <w:tcPr>
-            <w:tcW w:w="3041" w:type="dxa"/>
-          </w:tcPr>
-          <w:p>
-            <w:pPr>
-              <w:spacing w:after="0" w:line="240" w:lineRule="auto"/>
-              <w:jc w:val="center"/>
-              <w:rPr>
-                <w:rFonts w:eastAsia="Times New Roman" w:cs="Arial"/>
-                <w:bCs/>
-                <w:color w:val="000000"/>
-                <w:sz w:val="20"/>
-                <w:szCs w:val="20"/>
-                <w:lang w:eastAsia="es-VE"/>
-              </w:rPr>
-            </w:pPr>
-            <w:r>
-              <w:rPr>
-                <w:rFonts w:eastAsia="Times New Roman" w:cs="Arial"/>
-                <w:bCs/>
-                <w:color w:val="000000"/>
-                <w:sz w:val="20"/>
-                <w:szCs w:val="20"/>
-                <w:lang w:eastAsia="es-VE"/>
-              </w:rPr>
-              <w:t xml:space="preserve">Acta de constitución en proceso de </w:t>
-            </w:r>
-            <w:r>
-              <w:rPr>
-                <w:rFonts w:eastAsia="Times New Roman" w:cs="Arial"/>
-                <w:bCs/>
-                <w:color w:val="000000"/>
-                <w:sz w:val="20"/>
-                <w:szCs w:val="20"/>
-                <w:lang w:eastAsia="es-VE"/>
-              </w:rPr>
-              <w:t xml:space="preserve">finalización y también </w:t>
-            </w:r>
-            <w:r>
-              <w:rPr>
-                <w:rFonts w:eastAsia="Times New Roman" w:cs="Arial"/>
-                <w:bCs/>
-                <w:color w:val="000000"/>
-                <w:sz w:val="20"/>
-                <w:szCs w:val="20"/>
-                <w:lang w:eastAsia="es-VE"/>
-              </w:rPr>
-              <w:t>verificación</w:t>
-            </w:r>
-            <w:r>
-              <w:rPr>
-                <w:rFonts w:eastAsia="Times New Roman" w:cs="Arial"/>
-                <w:bCs/>
-                <w:color w:val="000000"/>
-                <w:sz w:val="20"/>
-                <w:szCs w:val="20"/>
-                <w:lang w:eastAsia="es-VE"/>
-              </w:rPr>
-              <w:t>. De acuerdo a las debidas correcciones que se estipulen el acta será debidamente modificada y finalizada.</w:t>
-            </w:r>
           </w:p>
         </w:tc>
       </w:tr>
@@ -2463,8 +2422,8 @@
         <w:tblLook w:val="04A0" w:firstRow="1" w:lastRow="0" w:firstColumn="1" w:lastColumn="0" w:noHBand="0" w:noVBand="1"/>
       </w:tblPr>
       <w:tblGrid>
-        <w:gridCol w:w="3081"/>
-        <w:gridCol w:w="5639"/>
+        <w:gridCol w:w="3080"/>
+        <w:gridCol w:w="5640"/>
       </w:tblGrid>
       <w:tr>
         <w:tc>
@@ -2506,15 +2465,6 @@
                 <w:lang w:eastAsia="es-VE"/>
               </w:rPr>
             </w:pPr>
-            <w:r>
-              <w:rPr>
-                <w:rFonts w:eastAsia="Times New Roman" w:cs="Arial"/>
-                <w:color w:val="000000"/>
-                <w:szCs w:val="24"/>
-                <w:lang w:eastAsia="es-VE"/>
-              </w:rPr>
-              <w:t>Nexus Tech</w:t>
-            </w:r>
           </w:p>
         </w:tc>
       </w:tr>
@@ -2574,25 +2524,34 @@
                 <w:szCs w:val="24"/>
                 <w:lang w:eastAsia="es-VE"/>
               </w:rPr>
-              <w:t>Me</w:t>
-            </w:r>
-            <w:r>
-              <w:rPr>
-                <w:rFonts w:eastAsia="Times New Roman" w:cs="Arial"/>
-                <w:color w:val="000000"/>
-                <w:szCs w:val="24"/>
-                <w:lang w:eastAsia="es-VE"/>
-              </w:rPr>
-              <w:t>rcado Libre</w:t>
-            </w:r>
-            <w:r>
-              <w:rPr>
-                <w:rFonts w:eastAsia="Times New Roman" w:cs="Arial"/>
-                <w:color w:val="000000"/>
-                <w:szCs w:val="24"/>
-                <w:lang w:eastAsia="es-VE"/>
-              </w:rPr>
-              <w:t xml:space="preserve"> – Plataforma de Comercio Electrónico</w:t>
+              <w:t>M</w:t>
+            </w:r>
+            <w:r>
+              <w:rPr>
+                <w:rFonts w:eastAsia="Times New Roman" w:cs="Arial"/>
+                <w:color w:val="000000"/>
+                <w:szCs w:val="24"/>
+                <w:lang w:eastAsia="es-VE"/>
+              </w:rPr>
+              <w:t>arketplace</w:t>
+            </w:r>
+            <w:r>
+              <w:rPr>
+                <w:rFonts w:eastAsia="Times New Roman" w:cs="Arial"/>
+                <w:color w:val="000000"/>
+                <w:szCs w:val="24"/>
+                <w:lang w:eastAsia="es-VE"/>
+              </w:rPr>
+              <w:t xml:space="preserve"> – Plataforma de</w:t>
+            </w:r>
+            <w:r>
+              <w:rPr>
+                <w:rFonts w:eastAsia="Times New Roman" w:cs="Arial"/>
+                <w:color w:val="000000"/>
+                <w:szCs w:val="24"/>
+                <w:lang w:eastAsia="es-VE"/>
+              </w:rPr>
+              <w:t xml:space="preserve"> viajes Online</w:t>
             </w:r>
           </w:p>
         </w:tc>
@@ -2629,7 +2588,10 @@
           </w:tcPr>
           <w:p>
             <w:r>
-              <w:t>06/09/2026</w:t>
+              <w:t>18</w:t>
+            </w:r>
+            <w:r>
+              <w:t>/09/2026</w:t>
             </w:r>
           </w:p>
         </w:tc>
@@ -2681,7 +2643,7 @@
                 <w:szCs w:val="24"/>
                 <w:lang w:eastAsia="es-VE"/>
               </w:rPr>
-              <w:t>Mercado Libre</w:t>
+              <w:t>Inversiones LR</w:t>
             </w:r>
           </w:p>
         </w:tc>
@@ -2735,7 +2697,7 @@
                 <w:u w:val="single"/>
                 <w:lang w:eastAsia="es-VE"/>
               </w:rPr>
-              <w:t>Mercado Libre</w:t>
+              <w:t>Inversiones LR</w:t>
             </w:r>
           </w:p>
         </w:tc>
@@ -8688,28 +8650,8 @@
                 <w:sz w:val="22"/>
                 <w:lang w:val="es-CO" w:eastAsia="es-CO"/>
               </w:rPr>
-              <w:t>Grabación</w:t>
-            </w:r>
-            <w:r>
-              <w:rPr>
-                <w:rFonts w:ascii="Aptos Narrow" w:eastAsia="Times New Roman" w:hAnsi="Aptos Narrow"/>
-                <w:color w:val="000000"/>
-                <w:sz w:val="22"/>
-                <w:lang w:val="es-CO" w:eastAsia="es-CO"/>
-              </w:rPr>
-              <w:t xml:space="preserve"> y edición </w:t>
-            </w:r>
-            <w:proofErr w:type="gramStart"/>
-            <w:r>
-              <w:rPr>
-                <w:rFonts w:ascii="Aptos Narrow" w:eastAsia="Times New Roman" w:hAnsi="Aptos Narrow"/>
-                <w:color w:val="000000"/>
-                <w:sz w:val="22"/>
-                <w:lang w:val="es-CO" w:eastAsia="es-CO"/>
-              </w:rPr>
-              <w:t>del video presentación</w:t>
-            </w:r>
-            <w:proofErr w:type="gramEnd"/>
+              <w:t>Grabación y edición del video presentación</w:t>
+            </w:r>
           </w:p>
         </w:tc>
         <w:tc>
@@ -10671,13 +10613,8 @@
             <w:r>
               <w:t xml:space="preserve">Los problemas o situaciones que no tengan solución por parte del equipo, </w:t>
             </w:r>
-            <w:proofErr w:type="gramStart"/>
-            <w:r>
-              <w:t>tendrá</w:t>
-            </w:r>
-            <w:proofErr w:type="gramEnd"/>
-            <w:r>
-              <w:t xml:space="preserve"> que ser escalada al profesor.</w:t>
+            <w:r>
+              <w:t>tendrá que ser escalada al profesor.</w:t>
             </w:r>
           </w:p>
         </w:tc>
@@ -11141,18 +11078,13 @@
               <w:jc w:val="center"/>
             </w:pPr>
             <w:r>
-              <w:t>Desarrollador (</w:t>
-            </w:r>
-            <w:proofErr w:type="gramStart"/>
-            <w:r>
-              <w:t>persistencia .</w:t>
+              <w:t>Desarrollador (persistencia .</w:t>
             </w:r>
             <w:proofErr w:type="spellStart"/>
             <w:r>
               <w:t>json</w:t>
             </w:r>
             <w:proofErr w:type="spellEnd"/>
-            <w:proofErr w:type="gramEnd"/>
             <w:r>
               <w:t>)</w:t>
             </w:r>
@@ -11623,21 +11555,48 @@
               <w:lang w:eastAsia="es-CO"/>
             </w:rPr>
             <w:drawing>
-              <wp:inline distT="0" distB="0" distL="0" distR="0" wp14:anchorId="6152C49E" wp14:editId="3F4DCA13">
-                <wp:extent cx="781050" cy="676275"/>
-                <wp:effectExtent l="0" t="0" r="0" b="9525"/>
-                <wp:docPr id="2" name="Imagen 13"/>
-                <wp:cNvGraphicFramePr/>
+              <wp:anchor distT="0" distB="0" distL="114300" distR="114300" simplePos="0" relativeHeight="251662336" behindDoc="1" locked="0" layoutInCell="1" allowOverlap="1" wp14:anchorId="2ABC24EF" wp14:editId="2B63966B">
+                <wp:simplePos x="0" y="0"/>
+                <wp:positionH relativeFrom="column">
+                  <wp:posOffset>67310</wp:posOffset>
+                </wp:positionH>
+                <wp:positionV relativeFrom="page">
+                  <wp:posOffset>86360</wp:posOffset>
+                </wp:positionV>
+                <wp:extent cx="619125" cy="561975"/>
+                <wp:effectExtent l="0" t="0" r="9525" b="9525"/>
+                <wp:wrapThrough wrapText="bothSides">
+                  <wp:wrapPolygon edited="0">
+                    <wp:start x="5317" y="0"/>
+                    <wp:lineTo x="5982" y="11715"/>
+                    <wp:lineTo x="0" y="13912"/>
+                    <wp:lineTo x="0" y="21234"/>
+                    <wp:lineTo x="21268" y="21234"/>
+                    <wp:lineTo x="21268" y="13912"/>
+                    <wp:lineTo x="15286" y="11715"/>
+                    <wp:lineTo x="15951" y="0"/>
+                    <wp:lineTo x="5317" y="0"/>
+                  </wp:wrapPolygon>
+                </wp:wrapThrough>
+                <wp:docPr id="442806375" name="Imagen 3"/>
+                <wp:cNvGraphicFramePr>
+                  <a:graphicFrameLocks xmlns:a="http://schemas.openxmlformats.org/drawingml/2006/main" noChangeAspect="1"/>
+                </wp:cNvGraphicFramePr>
                 <a:graphic xmlns:a="http://schemas.openxmlformats.org/drawingml/2006/main">
                   <a:graphicData uri="http://schemas.openxmlformats.org/drawingml/2006/picture">
                     <pic:pic xmlns:pic="http://schemas.openxmlformats.org/drawingml/2006/picture">
                       <pic:nvPicPr>
-                        <pic:cNvPr id="0" name=""/>
+                        <pic:cNvPr id="442806375" name="Imagen 442806375"/>
                         <pic:cNvPicPr/>
                       </pic:nvPicPr>
                       <pic:blipFill>
-                        <a:blip r:embed="rId1"/>
-                        <a:srcRect/>
+                        <a:blip r:embed="rId1">
+                          <a:extLst>
+                            <a:ext uri="{28A0092B-C50C-407E-A947-70E740481C1C}">
+                              <a14:useLocalDpi xmlns:a14="http://schemas.microsoft.com/office/drawing/2010/main" val="0"/>
+                            </a:ext>
+                          </a:extLst>
+                        </a:blip>
                         <a:stretch>
                           <a:fillRect/>
                         </a:stretch>
@@ -11645,21 +11604,16 @@
                       <pic:spPr>
                         <a:xfrm>
                           <a:off x="0" y="0"/>
-                          <a:ext cx="782033" cy="677126"/>
+                          <a:ext cx="619125" cy="561975"/>
                         </a:xfrm>
                         <a:prstGeom prst="rect">
                           <a:avLst/>
                         </a:prstGeom>
-                        <a:noFill/>
-                        <a:ln>
-                          <a:noFill/>
-                          <a:prstDash/>
-                        </a:ln>
                       </pic:spPr>
                     </pic:pic>
                   </a:graphicData>
                 </a:graphic>
-              </wp:inline>
+              </wp:anchor>
             </w:drawing>
           </w:r>
         </w:p>
@@ -14528,7 +14482,6 @@
   <w:style w:type="character" w:default="1" w:styleId="Fuentedeprrafopredeter">
     <w:name w:val="Default Paragraph Font"/>
     <w:uiPriority w:val="1"/>
-    <w:semiHidden/>
     <w:unhideWhenUsed/>
   </w:style>
   <w:style w:type="table" w:default="1" w:styleId="Tablanormal">

</xml_diff>

<commit_message>
Update acta de contitucion 2
The project purpose, justification, and description along with the deliverables have been completed, pending review and possible changes.
</commit_message>
<xml_diff>
--- a/Acta de Constitución - modulo 2.docx
+++ b/Acta de Constitución - modulo 2.docx
@@ -2809,43 +2809,7 @@
                 <w:szCs w:val="24"/>
                 <w:lang w:eastAsia="es-VE"/>
               </w:rPr>
-              <w:t>Este proyecto tiene como propósito desarrollar</w:t>
-            </w:r>
-            <w:r>
-              <w:rPr>
-                <w:rFonts w:eastAsia="Times New Roman" w:cs="Arial"/>
-                <w:color w:val="000000"/>
-                <w:szCs w:val="24"/>
-                <w:lang w:eastAsia="es-VE"/>
-              </w:rPr>
-              <w:t xml:space="preserve"> una aplicación que permita a los usuarios mostrar, crear, actualizar y eliminar productos que se encuentren disponibles en la misma. Los usuarios tendrán permitido </w:t>
-            </w:r>
-            <w:r>
-              <w:rPr>
-                <w:rFonts w:eastAsia="Times New Roman" w:cs="Arial"/>
-                <w:color w:val="000000"/>
-                <w:szCs w:val="24"/>
-                <w:lang w:eastAsia="es-VE"/>
-              </w:rPr>
-              <w:t>la interacción con los objetos disponibles así mismo con sus imágenes. El proyecto trabajará con la compra</w:t>
-            </w:r>
-            <w:r>
-              <w:rPr>
-                <w:rFonts w:eastAsia="Times New Roman" w:cs="Arial"/>
-                <w:color w:val="000000"/>
-                <w:szCs w:val="24"/>
-                <w:lang w:eastAsia="es-VE"/>
-              </w:rPr>
-              <w:t xml:space="preserve"> de productos y con la sección de entretenimiento</w:t>
-            </w:r>
-            <w:r>
-              <w:rPr>
-                <w:rFonts w:eastAsia="Times New Roman" w:cs="Arial"/>
-                <w:color w:val="000000"/>
-                <w:szCs w:val="24"/>
-                <w:lang w:eastAsia="es-VE"/>
-              </w:rPr>
-              <w:t>.</w:t>
+              <w:t>Este proyecto tiene como objetivo cumplir con los requerimientos presentados por la empresa Inversiones LR con respecto al contrato de creación de una pagina web que permita la interacción de la empresa con clientes de manera virtual.</w:t>
             </w:r>
           </w:p>
           <w:p>
@@ -2859,63 +2823,6 @@
                 <w:lang w:eastAsia="es-VE"/>
               </w:rPr>
             </w:pPr>
-          </w:p>
-          <w:p>
-            <w:pPr>
-              <w:spacing w:after="0" w:line="240" w:lineRule="auto"/>
-              <w:jc w:val="both"/>
-              <w:rPr>
-                <w:rFonts w:eastAsia="Times New Roman" w:cs="Arial"/>
-                <w:color w:val="000000"/>
-                <w:szCs w:val="24"/>
-                <w:lang w:eastAsia="es-VE"/>
-              </w:rPr>
-            </w:pPr>
-            <w:r>
-              <w:rPr>
-                <w:rFonts w:eastAsia="Times New Roman" w:cs="Arial"/>
-                <w:color w:val="000000"/>
-                <w:szCs w:val="24"/>
-                <w:lang w:eastAsia="es-VE"/>
-              </w:rPr>
-              <w:t xml:space="preserve">Con este proyecto </w:t>
-            </w:r>
-            <w:r>
-              <w:rPr>
-                <w:rFonts w:eastAsia="Times New Roman" w:cs="Arial"/>
-                <w:color w:val="000000"/>
-                <w:szCs w:val="24"/>
-                <w:lang w:eastAsia="es-VE"/>
-              </w:rPr>
-              <w:t xml:space="preserve">nos permitimos facilitar la accesibilidad tanto de usuarios como de vendedores al momento de querer adquirir o vender un producto de interés y con ello, </w:t>
-            </w:r>
-            <w:r>
-              <w:rPr>
-                <w:rFonts w:eastAsia="Times New Roman" w:cs="Arial"/>
-                <w:color w:val="000000"/>
-                <w:szCs w:val="24"/>
-                <w:lang w:eastAsia="es-VE"/>
-              </w:rPr>
-              <w:t>observamos las dinámicas durante la comunicación entre</w:t>
-            </w:r>
-            <w:r>
-              <w:rPr>
-                <w:rFonts w:eastAsia="Times New Roman" w:cs="Arial"/>
-                <w:color w:val="000000"/>
-                <w:szCs w:val="24"/>
-                <w:lang w:eastAsia="es-VE"/>
-              </w:rPr>
-              <w:t xml:space="preserve"> estos mismos actores. Por otro lado, nos permite a nosotros como desarrolladores, aplicar conocimientos adquiridos en la primera sección del semestre por medio del presente proyecto</w:t>
-            </w:r>
-            <w:r>
-              <w:rPr>
-                <w:rFonts w:eastAsia="Times New Roman" w:cs="Arial"/>
-                <w:color w:val="000000"/>
-                <w:szCs w:val="24"/>
-                <w:lang w:eastAsia="es-VE"/>
-              </w:rPr>
-              <w:t>.</w:t>
-            </w:r>
           </w:p>
           <w:p>
             <w:pPr>
@@ -2973,33 +2880,96 @@
           </w:tcPr>
           <w:p>
             <w:pPr>
-              <w:spacing w:after="0" w:line="240" w:lineRule="auto"/>
-              <w:rPr>
-                <w:rFonts w:eastAsia="Times New Roman" w:cs="Arial"/>
-                <w:color w:val="000000"/>
-                <w:szCs w:val="24"/>
-                <w:lang w:eastAsia="es-VE"/>
-              </w:rPr>
-            </w:pPr>
-          </w:p>
-          <w:p>
-            <w:pPr>
-              <w:spacing w:after="0" w:line="240" w:lineRule="auto"/>
-              <w:rPr>
-                <w:rFonts w:eastAsia="Times New Roman" w:cs="Arial"/>
-                <w:color w:val="000000"/>
-                <w:szCs w:val="24"/>
-                <w:lang w:eastAsia="es-VE"/>
-              </w:rPr>
-            </w:pPr>
-            <w:r>
-              <w:rPr>
-                <w:rFonts w:eastAsia="Times New Roman" w:cs="Arial"/>
-                <w:color w:val="000000"/>
-                <w:szCs w:val="24"/>
-                <w:lang w:eastAsia="es-VE"/>
-              </w:rPr>
-              <w:t xml:space="preserve">Este proyecto consta en el desarrollo de una página web de comercio electrónico en el cual será inspirando por la plataforma Mercado Libre, donde su objetivo principal es la comunicación entre usuarios (compradores y </w:t>
+              <w:pStyle w:val="Prrafodelista"/>
+              <w:spacing w:after="0" w:line="240" w:lineRule="auto"/>
+              <w:rPr>
+                <w:rFonts w:eastAsia="Times New Roman" w:cs="Arial"/>
+                <w:color w:val="000000"/>
+                <w:szCs w:val="24"/>
+                <w:lang w:eastAsia="es-VE"/>
+              </w:rPr>
+            </w:pPr>
+          </w:p>
+          <w:p>
+            <w:pPr>
+              <w:spacing w:after="0" w:line="240" w:lineRule="auto"/>
+              <w:rPr>
+                <w:rFonts w:eastAsia="Times New Roman" w:cs="Arial"/>
+                <w:color w:val="000000"/>
+                <w:szCs w:val="24"/>
+                <w:lang w:eastAsia="es-VE"/>
+              </w:rPr>
+            </w:pPr>
+            <w:r>
+              <w:rPr>
+                <w:rFonts w:eastAsia="Times New Roman" w:cs="Arial"/>
+                <w:color w:val="000000"/>
+                <w:szCs w:val="24"/>
+                <w:lang w:eastAsia="es-VE"/>
+              </w:rPr>
+              <w:t>El proyecto se considerará concluido cuando se haga entrega del código fuente y la URL única de la pagina a la empresa antes seleccionada.</w:t>
+            </w:r>
+          </w:p>
+          <w:p>
+            <w:pPr>
+              <w:spacing w:after="0" w:line="240" w:lineRule="auto"/>
+              <w:rPr>
+                <w:rFonts w:eastAsia="Times New Roman" w:cs="Arial"/>
+                <w:color w:val="000000"/>
+                <w:szCs w:val="24"/>
+                <w:lang w:eastAsia="es-VE"/>
+              </w:rPr>
+            </w:pPr>
+          </w:p>
+          <w:p>
+            <w:pPr>
+              <w:spacing w:after="0" w:line="240" w:lineRule="auto"/>
+              <w:rPr>
+                <w:rFonts w:eastAsia="Times New Roman" w:cs="Arial"/>
+                <w:color w:val="000000"/>
+                <w:szCs w:val="24"/>
+                <w:lang w:eastAsia="es-VE"/>
+              </w:rPr>
+            </w:pPr>
+            <w:r>
+              <w:rPr>
+                <w:rFonts w:eastAsia="Times New Roman" w:cs="Arial"/>
+                <w:color w:val="000000"/>
+                <w:szCs w:val="24"/>
+                <w:lang w:eastAsia="es-VE"/>
+              </w:rPr>
+              <w:t>Los requerimientos mínimos de entrega serán la implementación de mínimo 1 pagina que permita la visualización del nombre de la plataforma, descripción de la misma, alojamientos destacados y acceso a búsqueda de alojamientos.</w:t>
+            </w:r>
+          </w:p>
+          <w:p>
+            <w:pPr>
+              <w:spacing w:after="0" w:line="240" w:lineRule="auto"/>
+              <w:rPr>
+                <w:rFonts w:eastAsia="Times New Roman" w:cs="Arial"/>
+                <w:color w:val="000000"/>
+                <w:szCs w:val="24"/>
+                <w:lang w:eastAsia="es-VE"/>
+              </w:rPr>
+            </w:pPr>
+          </w:p>
+          <w:p>
+            <w:pPr>
+              <w:spacing w:after="0" w:line="240" w:lineRule="auto"/>
+              <w:rPr>
+                <w:rFonts w:eastAsia="Times New Roman" w:cs="Arial"/>
+                <w:color w:val="000000"/>
+                <w:szCs w:val="24"/>
+                <w:lang w:eastAsia="es-VE"/>
+              </w:rPr>
+            </w:pPr>
+            <w:r>
+              <w:rPr>
+                <w:rFonts w:eastAsia="Times New Roman" w:cs="Arial"/>
+                <w:color w:val="000000"/>
+                <w:szCs w:val="24"/>
+                <w:lang w:eastAsia="es-VE"/>
+              </w:rPr>
+              <w:t xml:space="preserve">Cada uno de los alojamientos presentados anteriormente deberá poseer de manera concisa cierta información clave para su correcto funcionamiento, como </w:t>
             </w:r>
             <w:r>
               <w:rPr>
@@ -3009,182 +2979,194 @@
                 <w:lang w:eastAsia="es-VE"/>
               </w:rPr>
               <w:lastRenderedPageBreak/>
-              <w:t xml:space="preserve">vendedores) para la adquisición y venta de diferentes productos. Estos se darán gracias a las publicaciones que los vendedores generen. Dentro de las publicaciones se podrá </w:t>
-            </w:r>
-            <w:r>
-              <w:rPr>
-                <w:rFonts w:eastAsia="Times New Roman" w:cs="Arial"/>
-                <w:color w:val="000000"/>
-                <w:szCs w:val="24"/>
-                <w:lang w:eastAsia="es-VE"/>
-              </w:rPr>
-              <w:t>encontrar tanto la información del producto</w:t>
-            </w:r>
-            <w:r>
-              <w:rPr>
-                <w:rFonts w:eastAsia="Times New Roman" w:cs="Arial"/>
-                <w:color w:val="000000"/>
-                <w:szCs w:val="24"/>
-                <w:lang w:eastAsia="es-VE"/>
-              </w:rPr>
-              <w:t xml:space="preserve"> (lo que denotamos como el nombre, descripción, precio, categorías, disponibilidad)</w:t>
-            </w:r>
-            <w:r>
-              <w:rPr>
-                <w:rFonts w:eastAsia="Times New Roman" w:cs="Arial"/>
-                <w:color w:val="000000"/>
-                <w:szCs w:val="24"/>
-                <w:lang w:eastAsia="es-VE"/>
-              </w:rPr>
-              <w:t xml:space="preserve">, como imágenes relacionadas al mismo. Los usuarios podrán tanto crear productos, como </w:t>
-            </w:r>
-            <w:r>
-              <w:rPr>
-                <w:rFonts w:eastAsia="Times New Roman" w:cs="Arial"/>
-                <w:color w:val="000000"/>
-                <w:szCs w:val="24"/>
-                <w:lang w:eastAsia="es-VE"/>
-              </w:rPr>
-              <w:t>editarlos, actualizarlos y eliminarlos.</w:t>
-            </w:r>
-            <w:r>
-              <w:rPr>
-                <w:rFonts w:eastAsia="Times New Roman" w:cs="Arial"/>
-                <w:color w:val="000000"/>
-                <w:szCs w:val="24"/>
-                <w:lang w:eastAsia="es-VE"/>
-              </w:rPr>
-              <w:t xml:space="preserve"> Los compradores podrán explorar tanto por la </w:t>
-            </w:r>
-            <w:proofErr w:type="spellStart"/>
-            <w:r>
-              <w:rPr>
-                <w:rFonts w:eastAsia="Times New Roman" w:cs="Arial"/>
-                <w:color w:val="000000"/>
-                <w:szCs w:val="24"/>
-                <w:lang w:eastAsia="es-VE"/>
-              </w:rPr>
-              <w:t>pagina</w:t>
-            </w:r>
-            <w:proofErr w:type="spellEnd"/>
-            <w:r>
-              <w:rPr>
-                <w:rFonts w:eastAsia="Times New Roman" w:cs="Arial"/>
-                <w:color w:val="000000"/>
-                <w:szCs w:val="24"/>
-                <w:lang w:eastAsia="es-VE"/>
-              </w:rPr>
-              <w:t xml:space="preserve"> web, hasta generar búsquedas que sean del interés del comprador.</w:t>
-            </w:r>
-          </w:p>
-          <w:p>
-            <w:pPr>
-              <w:spacing w:after="0" w:line="240" w:lineRule="auto"/>
-              <w:rPr>
-                <w:rFonts w:eastAsia="Times New Roman" w:cs="Arial"/>
-                <w:color w:val="000000"/>
-                <w:szCs w:val="24"/>
-                <w:lang w:eastAsia="es-VE"/>
-              </w:rPr>
-            </w:pPr>
-          </w:p>
-          <w:p>
-            <w:pPr>
-              <w:spacing w:after="0" w:line="240" w:lineRule="auto"/>
-              <w:rPr>
-                <w:rFonts w:eastAsia="Times New Roman" w:cs="Arial"/>
-                <w:color w:val="000000"/>
-                <w:szCs w:val="24"/>
-                <w:lang w:eastAsia="es-VE"/>
-              </w:rPr>
-            </w:pPr>
-            <w:r>
-              <w:rPr>
-                <w:rFonts w:eastAsia="Times New Roman" w:cs="Arial"/>
-                <w:color w:val="000000"/>
-                <w:szCs w:val="24"/>
-                <w:lang w:eastAsia="es-VE"/>
-              </w:rPr>
-              <w:t xml:space="preserve">La </w:t>
-            </w:r>
-            <w:proofErr w:type="spellStart"/>
-            <w:r>
-              <w:rPr>
-                <w:rFonts w:eastAsia="Times New Roman" w:cs="Arial"/>
-                <w:color w:val="000000"/>
-                <w:szCs w:val="24"/>
-                <w:lang w:eastAsia="es-VE"/>
-              </w:rPr>
-              <w:t>pagina</w:t>
-            </w:r>
-            <w:proofErr w:type="spellEnd"/>
-            <w:r>
-              <w:rPr>
-                <w:rFonts w:eastAsia="Times New Roman" w:cs="Arial"/>
-                <w:color w:val="000000"/>
-                <w:szCs w:val="24"/>
-                <w:lang w:eastAsia="es-VE"/>
-              </w:rPr>
-              <w:t xml:space="preserve"> web será desarrollada por medio de Angular en el entorno de </w:t>
-            </w:r>
-            <w:proofErr w:type="spellStart"/>
-            <w:r>
-              <w:rPr>
-                <w:rFonts w:eastAsia="Times New Roman" w:cs="Arial"/>
-                <w:color w:val="000000"/>
-                <w:szCs w:val="24"/>
-                <w:lang w:eastAsia="es-VE"/>
-              </w:rPr>
-              <w:t>WebStorm</w:t>
-            </w:r>
-            <w:proofErr w:type="spellEnd"/>
-            <w:r>
-              <w:rPr>
-                <w:rFonts w:eastAsia="Times New Roman" w:cs="Arial"/>
-                <w:color w:val="000000"/>
-                <w:szCs w:val="24"/>
-                <w:lang w:eastAsia="es-VE"/>
-              </w:rPr>
-              <w:t xml:space="preserve">, donde nos permitirá trabajar tanto en la lógica del proyecto, como en la </w:t>
-            </w:r>
-            <w:r>
-              <w:rPr>
-                <w:rFonts w:eastAsia="Times New Roman" w:cs="Arial"/>
-                <w:color w:val="000000"/>
-                <w:szCs w:val="24"/>
-                <w:lang w:eastAsia="es-VE"/>
-              </w:rPr>
-              <w:t>interfaz gráfica. Esta última permite la interacción del usuario frente a las diferentes opciones establecidas anteriormente junto con demás características.</w:t>
-            </w:r>
-          </w:p>
-          <w:p>
-            <w:pPr>
-              <w:spacing w:after="0" w:line="240" w:lineRule="auto"/>
-              <w:rPr>
-                <w:rFonts w:eastAsia="Times New Roman" w:cs="Arial"/>
-                <w:color w:val="000000"/>
-                <w:szCs w:val="24"/>
-                <w:lang w:eastAsia="es-VE"/>
-              </w:rPr>
-            </w:pPr>
-          </w:p>
-          <w:p>
-            <w:pPr>
-              <w:spacing w:after="0" w:line="240" w:lineRule="auto"/>
-              <w:rPr>
-                <w:rFonts w:eastAsia="Times New Roman" w:cs="Arial"/>
-                <w:b/>
-                <w:bCs/>
-                <w:color w:val="000000"/>
-                <w:szCs w:val="24"/>
-                <w:lang w:eastAsia="es-VE"/>
-              </w:rPr>
-            </w:pPr>
-            <w:r>
-              <w:rPr>
-                <w:rFonts w:eastAsia="Times New Roman" w:cs="Arial"/>
-                <w:b/>
-                <w:bCs/>
+              <w:t>una imagen clara, nombre del lugar, ciudad donde se encuentra, entre otra información.</w:t>
+            </w:r>
+          </w:p>
+          <w:p>
+            <w:pPr>
+              <w:spacing w:after="0" w:line="240" w:lineRule="auto"/>
+              <w:rPr>
+                <w:rFonts w:eastAsia="Times New Roman" w:cs="Arial"/>
+                <w:color w:val="000000"/>
+                <w:szCs w:val="24"/>
+                <w:lang w:eastAsia="es-VE"/>
+              </w:rPr>
+            </w:pPr>
+          </w:p>
+          <w:p>
+            <w:pPr>
+              <w:spacing w:after="0" w:line="240" w:lineRule="auto"/>
+              <w:rPr>
+                <w:rFonts w:eastAsia="Times New Roman" w:cs="Arial"/>
+                <w:color w:val="000000"/>
+                <w:szCs w:val="24"/>
+                <w:lang w:eastAsia="es-VE"/>
+              </w:rPr>
+            </w:pPr>
+            <w:r>
+              <w:rPr>
+                <w:rFonts w:eastAsia="Times New Roman" w:cs="Arial"/>
+                <w:color w:val="000000"/>
+                <w:szCs w:val="24"/>
+                <w:lang w:eastAsia="es-VE"/>
+              </w:rPr>
+              <w:t xml:space="preserve">Otra implementación que se </w:t>
+            </w:r>
+            <w:r>
+              <w:rPr>
+                <w:rFonts w:eastAsia="Times New Roman" w:cs="Arial"/>
+                <w:color w:val="000000"/>
+                <w:szCs w:val="24"/>
+                <w:lang w:eastAsia="es-VE"/>
+              </w:rPr>
+              <w:t>realizará</w:t>
+            </w:r>
+            <w:r>
+              <w:rPr>
+                <w:rFonts w:eastAsia="Times New Roman" w:cs="Arial"/>
+                <w:color w:val="000000"/>
+                <w:szCs w:val="24"/>
+                <w:lang w:eastAsia="es-VE"/>
+              </w:rPr>
+              <w:t xml:space="preserve"> será la búsqueda y filtrado de ciertos lugares </w:t>
+            </w:r>
+            <w:r>
+              <w:rPr>
+                <w:rFonts w:eastAsia="Times New Roman" w:cs="Arial"/>
+                <w:color w:val="000000"/>
+                <w:szCs w:val="24"/>
+                <w:lang w:eastAsia="es-VE"/>
+              </w:rPr>
+              <w:t>a partir</w:t>
+            </w:r>
+            <w:r>
+              <w:rPr>
+                <w:rFonts w:eastAsia="Times New Roman" w:cs="Arial"/>
+                <w:color w:val="000000"/>
+                <w:szCs w:val="24"/>
+                <w:lang w:eastAsia="es-VE"/>
+              </w:rPr>
+              <w:t xml:space="preserve"> de un sistema claro e </w:t>
+            </w:r>
+            <w:r>
+              <w:rPr>
+                <w:rFonts w:eastAsia="Times New Roman" w:cs="Arial"/>
+                <w:color w:val="000000"/>
+                <w:szCs w:val="24"/>
+                <w:lang w:eastAsia="es-VE"/>
+              </w:rPr>
+              <w:t>intuitivo</w:t>
+            </w:r>
+            <w:r>
+              <w:rPr>
+                <w:rFonts w:eastAsia="Times New Roman" w:cs="Arial"/>
+                <w:color w:val="000000"/>
+                <w:szCs w:val="24"/>
+                <w:lang w:eastAsia="es-VE"/>
+              </w:rPr>
+              <w:t xml:space="preserve">, detalles </w:t>
+            </w:r>
+            <w:r>
+              <w:rPr>
+                <w:rFonts w:eastAsia="Times New Roman" w:cs="Arial"/>
+                <w:color w:val="000000"/>
+                <w:szCs w:val="24"/>
+                <w:lang w:eastAsia="es-VE"/>
+              </w:rPr>
+              <w:t>más</w:t>
+            </w:r>
+            <w:r>
+              <w:rPr>
+                <w:rFonts w:eastAsia="Times New Roman" w:cs="Arial"/>
+                <w:color w:val="000000"/>
+                <w:szCs w:val="24"/>
+                <w:lang w:eastAsia="es-VE"/>
+              </w:rPr>
+              <w:t xml:space="preserve"> precisos sobre los diferentes </w:t>
+            </w:r>
+            <w:r>
+              <w:rPr>
+                <w:rFonts w:eastAsia="Times New Roman" w:cs="Arial"/>
+                <w:color w:val="000000"/>
+                <w:szCs w:val="24"/>
+                <w:lang w:eastAsia="es-VE"/>
+              </w:rPr>
+              <w:t>alojamientos</w:t>
+            </w:r>
+            <w:r>
+              <w:rPr>
+                <w:rFonts w:eastAsia="Times New Roman" w:cs="Arial"/>
+                <w:color w:val="000000"/>
+                <w:szCs w:val="24"/>
+                <w:lang w:eastAsia="es-VE"/>
+              </w:rPr>
+              <w:t xml:space="preserve">, </w:t>
+            </w:r>
+            <w:r>
+              <w:rPr>
+                <w:rFonts w:eastAsia="Times New Roman" w:cs="Arial"/>
+                <w:color w:val="000000"/>
+                <w:szCs w:val="24"/>
+                <w:lang w:eastAsia="es-VE"/>
+              </w:rPr>
+              <w:t>cotizaciones, reservas entre otros aspectos similares.</w:t>
+            </w:r>
+          </w:p>
+          <w:p>
+            <w:pPr>
+              <w:spacing w:after="0" w:line="240" w:lineRule="auto"/>
+              <w:rPr>
+                <w:rFonts w:eastAsia="Times New Roman" w:cs="Arial"/>
+                <w:color w:val="000000"/>
+                <w:szCs w:val="24"/>
+                <w:lang w:eastAsia="es-VE"/>
+              </w:rPr>
+            </w:pPr>
+          </w:p>
+          <w:p>
+            <w:pPr>
+              <w:spacing w:after="0" w:line="240" w:lineRule="auto"/>
+              <w:rPr>
+                <w:rFonts w:eastAsia="Times New Roman" w:cs="Arial"/>
+                <w:color w:val="000000"/>
+                <w:szCs w:val="24"/>
+                <w:lang w:eastAsia="es-VE"/>
+              </w:rPr>
+            </w:pPr>
+            <w:r>
+              <w:rPr>
+                <w:rFonts w:eastAsia="Times New Roman" w:cs="Arial"/>
+                <w:color w:val="000000"/>
+                <w:szCs w:val="24"/>
+                <w:lang w:eastAsia="es-VE"/>
+              </w:rPr>
+              <w:t>El proyecto se realizará utilizando el WebStorm, junto con el framework Angular, los datos almacenos dentro de la aplicación se encontrarán en diferentes archivos .json, añadido a esto, los estilos propios de la página presentada serán realizados de manera autónoma por los miembros del equipo usando diferentes tecnologías como HTML, css, typeScript, entre otras.</w:t>
+            </w:r>
+          </w:p>
+          <w:p>
+            <w:pPr>
+              <w:spacing w:after="0" w:line="240" w:lineRule="auto"/>
+              <w:rPr>
+                <w:rFonts w:eastAsia="Times New Roman" w:cs="Arial"/>
+                <w:color w:val="000000"/>
+                <w:szCs w:val="24"/>
+                <w:lang w:eastAsia="es-VE"/>
+              </w:rPr>
+            </w:pPr>
+          </w:p>
+          <w:p>
+            <w:pPr>
+              <w:spacing w:after="0" w:line="240" w:lineRule="auto"/>
+              <w:rPr>
+                <w:rFonts w:eastAsia="Times New Roman" w:cs="Arial"/>
+                <w:color w:val="000000"/>
+                <w:szCs w:val="24"/>
+                <w:lang w:eastAsia="es-VE"/>
+              </w:rPr>
+            </w:pPr>
+            <w:r>
+              <w:rPr>
+                <w:rFonts w:eastAsia="Times New Roman" w:cs="Arial"/>
                 <w:color w:val="000000"/>
                 <w:szCs w:val="24"/>
                 <w:lang w:eastAsia="es-VE"/>
@@ -3197,26 +3179,24 @@
               <w:pStyle w:val="Prrafodelista"/>
               <w:numPr>
                 <w:ilvl w:val="0"/>
-                <w:numId w:val="19"/>
+                <w:numId w:val="22"/>
               </w:numPr>
               <w:spacing w:after="0" w:line="240" w:lineRule="auto"/>
               <w:rPr>
                 <w:rFonts w:eastAsia="Times New Roman" w:cs="Arial"/>
-                <w:b/>
-                <w:bCs/>
-                <w:color w:val="000000"/>
-                <w:szCs w:val="24"/>
-                <w:lang w:eastAsia="es-VE"/>
-              </w:rPr>
-            </w:pPr>
-            <w:r>
-              <w:rPr>
-                <w:rFonts w:eastAsia="Times New Roman" w:cs="Arial"/>
-                <w:color w:val="000000"/>
-                <w:szCs w:val="24"/>
-                <w:lang w:eastAsia="es-VE"/>
-              </w:rPr>
-              <w:t>Acta de Constitución debidamente diligenciada, aprobada y firmada por el Docente a cargo, Diego Fernando Rodríguez Castañeda</w:t>
+                <w:color w:val="000000"/>
+                <w:szCs w:val="24"/>
+                <w:lang w:eastAsia="es-VE"/>
+              </w:rPr>
+            </w:pPr>
+            <w:r>
+              <w:rPr>
+                <w:rFonts w:eastAsia="Times New Roman" w:cs="Arial"/>
+                <w:color w:val="000000"/>
+                <w:szCs w:val="24"/>
+                <w:lang w:eastAsia="es-VE"/>
+              </w:rPr>
+              <w:t xml:space="preserve">Requerimientos funcionales. </w:t>
             </w:r>
           </w:p>
           <w:p>
@@ -3224,26 +3204,24 @@
               <w:pStyle w:val="Prrafodelista"/>
               <w:numPr>
                 <w:ilvl w:val="0"/>
-                <w:numId w:val="19"/>
+                <w:numId w:val="22"/>
               </w:numPr>
               <w:spacing w:after="0" w:line="240" w:lineRule="auto"/>
               <w:rPr>
                 <w:rFonts w:eastAsia="Times New Roman" w:cs="Arial"/>
-                <w:b/>
-                <w:bCs/>
-                <w:color w:val="000000"/>
-                <w:szCs w:val="24"/>
-                <w:lang w:eastAsia="es-VE"/>
-              </w:rPr>
-            </w:pPr>
-            <w:r>
-              <w:rPr>
-                <w:rFonts w:eastAsia="Times New Roman" w:cs="Arial"/>
-                <w:color w:val="000000"/>
-                <w:szCs w:val="24"/>
-                <w:lang w:eastAsia="es-VE"/>
-              </w:rPr>
-              <w:t>Código fuente del proyecto en Angular</w:t>
+                <w:color w:val="000000"/>
+                <w:szCs w:val="24"/>
+                <w:lang w:eastAsia="es-VE"/>
+              </w:rPr>
+            </w:pPr>
+            <w:r>
+              <w:rPr>
+                <w:rFonts w:eastAsia="Times New Roman" w:cs="Arial"/>
+                <w:color w:val="000000"/>
+                <w:szCs w:val="24"/>
+                <w:lang w:eastAsia="es-VE"/>
+              </w:rPr>
+              <w:t xml:space="preserve">Reglas de negocio. </w:t>
             </w:r>
           </w:p>
           <w:p>
@@ -3251,52 +3229,145 @@
               <w:pStyle w:val="Prrafodelista"/>
               <w:numPr>
                 <w:ilvl w:val="0"/>
-                <w:numId w:val="19"/>
+                <w:numId w:val="22"/>
               </w:numPr>
               <w:spacing w:after="0" w:line="240" w:lineRule="auto"/>
               <w:rPr>
                 <w:rFonts w:eastAsia="Times New Roman" w:cs="Arial"/>
-                <w:b/>
-                <w:bCs/>
-                <w:color w:val="000000"/>
-                <w:szCs w:val="24"/>
-                <w:lang w:eastAsia="es-VE"/>
-              </w:rPr>
-            </w:pPr>
-            <w:r>
-              <w:rPr>
-                <w:rFonts w:eastAsia="Times New Roman" w:cs="Arial"/>
-                <w:color w:val="000000"/>
-                <w:szCs w:val="24"/>
-                <w:lang w:eastAsia="es-VE"/>
-              </w:rPr>
-              <w:t>Video de presentación formal (participación de todos los integrantes)</w:t>
+                <w:color w:val="000000"/>
+                <w:szCs w:val="24"/>
+                <w:lang w:eastAsia="es-VE"/>
+              </w:rPr>
+            </w:pPr>
+            <w:r>
+              <w:rPr>
+                <w:rFonts w:eastAsia="Times New Roman" w:cs="Arial"/>
+                <w:color w:val="000000"/>
+                <w:szCs w:val="24"/>
+                <w:lang w:eastAsia="es-VE"/>
+              </w:rPr>
+              <w:t xml:space="preserve">Prototipos de las principales pantallas. </w:t>
             </w:r>
           </w:p>
           <w:p>
             <w:pPr>
               <w:pStyle w:val="Prrafodelista"/>
-              <w:spacing w:after="0" w:line="240" w:lineRule="auto"/>
-              <w:rPr>
-                <w:rFonts w:eastAsia="Times New Roman" w:cs="Arial"/>
-                <w:b/>
-                <w:bCs/>
-                <w:color w:val="000000"/>
-                <w:szCs w:val="24"/>
-                <w:lang w:eastAsia="es-VE"/>
-              </w:rPr>
-            </w:pPr>
-          </w:p>
-          <w:p>
-            <w:pPr>
-              <w:spacing w:after="0" w:line="240" w:lineRule="auto"/>
-              <w:rPr>
-                <w:rFonts w:eastAsia="Times New Roman" w:cs="Arial"/>
-                <w:color w:val="000000"/>
-                <w:szCs w:val="24"/>
-                <w:lang w:eastAsia="es-VE"/>
-              </w:rPr>
-            </w:pPr>
+              <w:numPr>
+                <w:ilvl w:val="0"/>
+                <w:numId w:val="22"/>
+              </w:numPr>
+              <w:spacing w:after="0" w:line="240" w:lineRule="auto"/>
+              <w:rPr>
+                <w:rFonts w:eastAsia="Times New Roman" w:cs="Arial"/>
+                <w:color w:val="000000"/>
+                <w:szCs w:val="24"/>
+                <w:lang w:eastAsia="es-VE"/>
+              </w:rPr>
+            </w:pPr>
+            <w:r>
+              <w:rPr>
+                <w:rFonts w:eastAsia="Times New Roman" w:cs="Arial"/>
+                <w:color w:val="000000"/>
+                <w:szCs w:val="24"/>
+                <w:lang w:eastAsia="es-VE"/>
+              </w:rPr>
+              <w:t xml:space="preserve">Identificación preliminar de los componentes de la aplicación. </w:t>
+            </w:r>
+          </w:p>
+          <w:p>
+            <w:pPr>
+              <w:pStyle w:val="Prrafodelista"/>
+              <w:numPr>
+                <w:ilvl w:val="0"/>
+                <w:numId w:val="22"/>
+              </w:numPr>
+              <w:spacing w:after="0" w:line="240" w:lineRule="auto"/>
+              <w:rPr>
+                <w:rFonts w:eastAsia="Times New Roman" w:cs="Arial"/>
+                <w:color w:val="000000"/>
+                <w:szCs w:val="24"/>
+                <w:lang w:eastAsia="es-VE"/>
+              </w:rPr>
+            </w:pPr>
+            <w:r>
+              <w:rPr>
+                <w:rFonts w:eastAsia="Times New Roman" w:cs="Arial"/>
+                <w:color w:val="000000"/>
+                <w:szCs w:val="24"/>
+                <w:lang w:eastAsia="es-VE"/>
+              </w:rPr>
+              <w:t xml:space="preserve">Estructura propuesta de navegación. </w:t>
+            </w:r>
+          </w:p>
+          <w:p>
+            <w:pPr>
+              <w:pStyle w:val="Prrafodelista"/>
+              <w:numPr>
+                <w:ilvl w:val="0"/>
+                <w:numId w:val="22"/>
+              </w:numPr>
+              <w:spacing w:after="0" w:line="240" w:lineRule="auto"/>
+              <w:rPr>
+                <w:rFonts w:eastAsia="Times New Roman" w:cs="Arial"/>
+                <w:color w:val="000000"/>
+                <w:szCs w:val="24"/>
+                <w:lang w:eastAsia="es-VE"/>
+              </w:rPr>
+            </w:pPr>
+            <w:r>
+              <w:rPr>
+                <w:rFonts w:eastAsia="Times New Roman" w:cs="Arial"/>
+                <w:color w:val="000000"/>
+                <w:szCs w:val="24"/>
+                <w:lang w:eastAsia="es-VE"/>
+              </w:rPr>
+              <w:t xml:space="preserve">URL del repositorio. </w:t>
+            </w:r>
+          </w:p>
+          <w:p>
+            <w:pPr>
+              <w:pStyle w:val="Prrafodelista"/>
+              <w:numPr>
+                <w:ilvl w:val="0"/>
+                <w:numId w:val="22"/>
+              </w:numPr>
+              <w:spacing w:after="0" w:line="240" w:lineRule="auto"/>
+              <w:rPr>
+                <w:rFonts w:eastAsia="Times New Roman" w:cs="Arial"/>
+                <w:color w:val="000000"/>
+                <w:szCs w:val="24"/>
+                <w:lang w:eastAsia="es-VE"/>
+              </w:rPr>
+            </w:pPr>
+            <w:r>
+              <w:rPr>
+                <w:rFonts w:eastAsia="Times New Roman" w:cs="Arial"/>
+                <w:color w:val="000000"/>
+                <w:szCs w:val="24"/>
+                <w:lang w:eastAsia="es-VE"/>
+              </w:rPr>
+              <w:t xml:space="preserve">Aplicación Angular funcional con su código fuente completo y las instrucciones de ejecución en archivo </w:t>
+            </w:r>
+            <w:proofErr w:type="spellStart"/>
+            <w:r>
+              <w:rPr>
+                <w:rFonts w:eastAsia="Times New Roman" w:cs="Arial"/>
+                <w:color w:val="000000"/>
+                <w:szCs w:val="24"/>
+                <w:lang w:eastAsia="es-VE"/>
+              </w:rPr>
+              <w:t>readme</w:t>
+            </w:r>
+            <w:proofErr w:type="spellEnd"/>
+            <w:r>
+              <w:rPr>
+                <w:rFonts w:eastAsia="Times New Roman" w:cs="Arial"/>
+                <w:color w:val="000000"/>
+                <w:szCs w:val="24"/>
+                <w:lang w:eastAsia="es-VE"/>
+              </w:rPr>
+              <w:t xml:space="preserve"> junto con los datos que uso para la aplicación. </w:t>
+            </w:r>
           </w:p>
         </w:tc>
       </w:tr>
@@ -3484,6 +3555,7 @@
                 <w:szCs w:val="24"/>
                 <w:lang w:eastAsia="es-VE"/>
               </w:rPr>
+              <w:lastRenderedPageBreak/>
               <w:t xml:space="preserve">La </w:t>
             </w:r>
             <w:proofErr w:type="spellStart"/>
@@ -3529,7 +3601,6 @@
                 <w:szCs w:val="24"/>
                 <w:lang w:eastAsia="es-VE"/>
               </w:rPr>
-              <w:lastRenderedPageBreak/>
               <w:t xml:space="preserve">La </w:t>
             </w:r>
             <w:proofErr w:type="spellStart"/>
@@ -3804,27 +3875,7 @@
                 <w:sz w:val="22"/>
                 <w:lang w:eastAsia="es-VE"/>
               </w:rPr>
-              <w:t xml:space="preserve">. Esta deberá ser desarrollado en Angular con </w:t>
-            </w:r>
-            <w:proofErr w:type="spellStart"/>
-            <w:r>
-              <w:rPr>
-                <w:rFonts w:eastAsia="Times New Roman" w:cs="Arial"/>
-                <w:color w:val="000000"/>
-                <w:sz w:val="22"/>
-                <w:lang w:eastAsia="es-VE"/>
-              </w:rPr>
-              <w:t>WebStorm</w:t>
-            </w:r>
-            <w:proofErr w:type="spellEnd"/>
-            <w:r>
-              <w:rPr>
-                <w:rFonts w:eastAsia="Times New Roman" w:cs="Arial"/>
-                <w:color w:val="000000"/>
-                <w:sz w:val="22"/>
-                <w:lang w:eastAsia="es-VE"/>
-              </w:rPr>
-              <w:t xml:space="preserve">. Su entrega final deberá ser en una carpeta .zip sin la carpeta </w:t>
+              <w:t xml:space="preserve">. Esta deberá ser desarrollado en Angular con WebStorm. Su entrega final deberá ser en una carpeta .zip sin la carpeta </w:t>
             </w:r>
             <w:proofErr w:type="spellStart"/>
             <w:r>
@@ -4123,6 +4174,7 @@
                 <w:rFonts w:cs="Arial"/>
                 <w:szCs w:val="24"/>
               </w:rPr>
+              <w:lastRenderedPageBreak/>
               <w:t>Completar el acta de Constitución con requerimientos y especificaciones establecidos</w:t>
             </w:r>
           </w:p>
@@ -4160,7 +4212,6 @@
                 <w:rFonts w:cs="Arial"/>
                 <w:szCs w:val="24"/>
               </w:rPr>
-              <w:lastRenderedPageBreak/>
               <w:t>Desarrollo y pruebas del código fuente.</w:t>
             </w:r>
           </w:p>
@@ -4259,15 +4310,7 @@
           </w:tcPr>
           <w:p>
             <w:r>
-              <w:t xml:space="preserve">100% de las herramientas utilizadas son gratuitas o de código abierto (Angular, </w:t>
-            </w:r>
-            <w:proofErr w:type="spellStart"/>
-            <w:r>
-              <w:t>WebStorm</w:t>
-            </w:r>
-            <w:proofErr w:type="spellEnd"/>
-            <w:r>
-              <w:t>, Git)</w:t>
+              <w:t>100% de las herramientas utilizadas son gratuitas o de código abierto (Angular, WebStorm, Git)</w:t>
             </w:r>
           </w:p>
         </w:tc>
@@ -4471,6 +4514,7 @@
                 <w:szCs w:val="24"/>
                 <w:lang w:eastAsia="es-VE"/>
               </w:rPr>
+              <w:lastRenderedPageBreak/>
               <w:t>1. Se da por hecho que cada integrante dispone de manera estable de los recursos tecnológicos requeridos, entre ellos equipo de cómputo propio, conexión a internet y el software necesario.</w:t>
             </w:r>
           </w:p>
@@ -4499,7 +4543,6 @@
                 <w:szCs w:val="24"/>
                 <w:lang w:eastAsia="es-VE"/>
               </w:rPr>
-              <w:lastRenderedPageBreak/>
               <w:t>2. Se asume que el equipo cuenta previamente con las bases técnicas en programación orientada a objetos y en el diseño de aplicaciones web.</w:t>
             </w:r>
           </w:p>
@@ -4874,7 +4917,6 @@
               </w:rPr>
             </w:pPr>
             <w:r>
-              <w:lastRenderedPageBreak/>
               <w:t>Que una coordinación deficiente entre los integrantes derive en un acoplamiento inadecuado entre los componentes o en errores de integración.</w:t>
             </w:r>
           </w:p>
@@ -9713,21 +9755,7 @@
               <w:rPr>
                 <w:sz w:val="22"/>
               </w:rPr>
-              <w:t xml:space="preserve">El proyecto no contempla un presupuesto monetario, dado que su desarrollo se realiza con recursos propios de los integrantes (equipos de cómputo personales y conexión a internet) y con herramientas de software gratuitas y de código abierto (Angular, </w:t>
-            </w:r>
-            <w:proofErr w:type="spellStart"/>
-            <w:r>
-              <w:rPr>
-                <w:sz w:val="22"/>
-              </w:rPr>
-              <w:t>WebStorm</w:t>
-            </w:r>
-            <w:proofErr w:type="spellEnd"/>
-            <w:r>
-              <w:rPr>
-                <w:sz w:val="22"/>
-              </w:rPr>
-              <w:t>, Git). El principal recurso invertido corresponde al tiempo de dedicación del equipo durante las semanas de desarrollo.</w:t>
+              <w:t>El proyecto no contempla un presupuesto monetario, dado que su desarrollo se realiza con recursos propios de los integrantes (equipos de cómputo personales y conexión a internet) y con herramientas de software gratuitas y de código abierto (Angular, WebStorm, Git). El principal recurso invertido corresponde al tiempo de dedicación del equipo durante las semanas de desarrollo.</w:t>
             </w:r>
           </w:p>
         </w:tc>
@@ -9805,7 +9833,6 @@
                 <w:szCs w:val="24"/>
                 <w:lang w:eastAsia="es-VE"/>
               </w:rPr>
-              <w:lastRenderedPageBreak/>
               <w:t>Nombre</w:t>
             </w:r>
           </w:p>
@@ -10127,6 +10154,7 @@
                 <w:szCs w:val="24"/>
                 <w:lang w:eastAsia="es-VE"/>
               </w:rPr>
+              <w:lastRenderedPageBreak/>
               <w:t>Nombre</w:t>
             </w:r>
           </w:p>
@@ -10371,7 +10399,6 @@
                 <w:szCs w:val="24"/>
                 <w:lang w:eastAsia="es-VE"/>
               </w:rPr>
-              <w:lastRenderedPageBreak/>
               <w:t>Decisiones de personal (</w:t>
             </w:r>
             <w:proofErr w:type="spellStart"/>
@@ -10703,7 +10730,6 @@
                 <w:szCs w:val="24"/>
                 <w:lang w:eastAsia="es-VE"/>
               </w:rPr>
-              <w:lastRenderedPageBreak/>
               <w:t>Nombre</w:t>
             </w:r>
           </w:p>
@@ -11078,15 +11104,7 @@
               <w:jc w:val="center"/>
             </w:pPr>
             <w:r>
-              <w:t>Desarrollador (persistencia .</w:t>
-            </w:r>
-            <w:proofErr w:type="spellStart"/>
-            <w:r>
-              <w:t>json</w:t>
-            </w:r>
-            <w:proofErr w:type="spellEnd"/>
-            <w:r>
-              <w:t>)</w:t>
+              <w:t>Desarrollador (persistencia .json)</w:t>
             </w:r>
           </w:p>
         </w:tc>
@@ -13000,6 +13018,118 @@
     </w:lvl>
   </w:abstractNum>
   <w:abstractNum w:abstractNumId="11" w15:restartNumberingAfterBreak="0">
+    <w:nsid w:val="4A1B29FD"/>
+    <w:multiLevelType w:val="hybridMultilevel"/>
+    <w:tmpl w:val="8A5A06F0"/>
+    <w:lvl w:ilvl="0" w:tplc="132CC07A">
+      <w:numFmt w:val="bullet"/>
+      <w:lvlText w:val="-"/>
+      <w:lvlJc w:val="left"/>
+      <w:pPr>
+        <w:ind w:left="720" w:hanging="360"/>
+      </w:pPr>
+      <w:rPr>
+        <w:rFonts w:ascii="Arial" w:eastAsia="Times New Roman" w:hAnsi="Arial" w:cs="Arial" w:hint="default"/>
+      </w:rPr>
+    </w:lvl>
+    <w:lvl w:ilvl="1" w:tplc="240A0003" w:tentative="1">
+      <w:start w:val="1"/>
+      <w:numFmt w:val="bullet"/>
+      <w:lvlText w:val="o"/>
+      <w:lvlJc w:val="left"/>
+      <w:pPr>
+        <w:ind w:left="1440" w:hanging="360"/>
+      </w:pPr>
+      <w:rPr>
+        <w:rFonts w:ascii="Courier New" w:hAnsi="Courier New" w:cs="Courier New" w:hint="default"/>
+      </w:rPr>
+    </w:lvl>
+    <w:lvl w:ilvl="2" w:tplc="240A0005" w:tentative="1">
+      <w:start w:val="1"/>
+      <w:numFmt w:val="bullet"/>
+      <w:lvlText w:val=""/>
+      <w:lvlJc w:val="left"/>
+      <w:pPr>
+        <w:ind w:left="2160" w:hanging="360"/>
+      </w:pPr>
+      <w:rPr>
+        <w:rFonts w:ascii="Wingdings" w:hAnsi="Wingdings" w:hint="default"/>
+      </w:rPr>
+    </w:lvl>
+    <w:lvl w:ilvl="3" w:tplc="240A0001" w:tentative="1">
+      <w:start w:val="1"/>
+      <w:numFmt w:val="bullet"/>
+      <w:lvlText w:val=""/>
+      <w:lvlJc w:val="left"/>
+      <w:pPr>
+        <w:ind w:left="2880" w:hanging="360"/>
+      </w:pPr>
+      <w:rPr>
+        <w:rFonts w:ascii="Symbol" w:hAnsi="Symbol" w:hint="default"/>
+      </w:rPr>
+    </w:lvl>
+    <w:lvl w:ilvl="4" w:tplc="240A0003" w:tentative="1">
+      <w:start w:val="1"/>
+      <w:numFmt w:val="bullet"/>
+      <w:lvlText w:val="o"/>
+      <w:lvlJc w:val="left"/>
+      <w:pPr>
+        <w:ind w:left="3600" w:hanging="360"/>
+      </w:pPr>
+      <w:rPr>
+        <w:rFonts w:ascii="Courier New" w:hAnsi="Courier New" w:cs="Courier New" w:hint="default"/>
+      </w:rPr>
+    </w:lvl>
+    <w:lvl w:ilvl="5" w:tplc="240A0005" w:tentative="1">
+      <w:start w:val="1"/>
+      <w:numFmt w:val="bullet"/>
+      <w:lvlText w:val=""/>
+      <w:lvlJc w:val="left"/>
+      <w:pPr>
+        <w:ind w:left="4320" w:hanging="360"/>
+      </w:pPr>
+      <w:rPr>
+        <w:rFonts w:ascii="Wingdings" w:hAnsi="Wingdings" w:hint="default"/>
+      </w:rPr>
+    </w:lvl>
+    <w:lvl w:ilvl="6" w:tplc="240A0001" w:tentative="1">
+      <w:start w:val="1"/>
+      <w:numFmt w:val="bullet"/>
+      <w:lvlText w:val=""/>
+      <w:lvlJc w:val="left"/>
+      <w:pPr>
+        <w:ind w:left="5040" w:hanging="360"/>
+      </w:pPr>
+      <w:rPr>
+        <w:rFonts w:ascii="Symbol" w:hAnsi="Symbol" w:hint="default"/>
+      </w:rPr>
+    </w:lvl>
+    <w:lvl w:ilvl="7" w:tplc="240A0003" w:tentative="1">
+      <w:start w:val="1"/>
+      <w:numFmt w:val="bullet"/>
+      <w:lvlText w:val="o"/>
+      <w:lvlJc w:val="left"/>
+      <w:pPr>
+        <w:ind w:left="5760" w:hanging="360"/>
+      </w:pPr>
+      <w:rPr>
+        <w:rFonts w:ascii="Courier New" w:hAnsi="Courier New" w:cs="Courier New" w:hint="default"/>
+      </w:rPr>
+    </w:lvl>
+    <w:lvl w:ilvl="8" w:tplc="240A0005" w:tentative="1">
+      <w:start w:val="1"/>
+      <w:numFmt w:val="bullet"/>
+      <w:lvlText w:val=""/>
+      <w:lvlJc w:val="left"/>
+      <w:pPr>
+        <w:ind w:left="6480" w:hanging="360"/>
+      </w:pPr>
+      <w:rPr>
+        <w:rFonts w:ascii="Wingdings" w:hAnsi="Wingdings" w:hint="default"/>
+      </w:rPr>
+    </w:lvl>
+  </w:abstractNum>
+  <w:abstractNum w:abstractNumId="12" w15:restartNumberingAfterBreak="0">
     <w:nsid w:val="56CF7F5B"/>
     <w:multiLevelType w:val="hybridMultilevel"/>
     <w:tmpl w:val="DB56FDA0"/>
@@ -13089,7 +13219,7 @@
       </w:pPr>
     </w:lvl>
   </w:abstractNum>
-  <w:abstractNum w:abstractNumId="12" w15:restartNumberingAfterBreak="0">
+  <w:abstractNum w:abstractNumId="13" w15:restartNumberingAfterBreak="0">
     <w:nsid w:val="57E65062"/>
     <w:multiLevelType w:val="hybridMultilevel"/>
     <w:tmpl w:val="A5DA3066"/>
@@ -13202,7 +13332,7 @@
       </w:rPr>
     </w:lvl>
   </w:abstractNum>
-  <w:abstractNum w:abstractNumId="13" w15:restartNumberingAfterBreak="0">
+  <w:abstractNum w:abstractNumId="14" w15:restartNumberingAfterBreak="0">
     <w:nsid w:val="584D3B16"/>
     <w:multiLevelType w:val="hybridMultilevel"/>
     <w:tmpl w:val="2CE231F0"/>
@@ -13315,7 +13445,7 @@
       </w:rPr>
     </w:lvl>
   </w:abstractNum>
-  <w:abstractNum w:abstractNumId="14" w15:restartNumberingAfterBreak="0">
+  <w:abstractNum w:abstractNumId="15" w15:restartNumberingAfterBreak="0">
     <w:nsid w:val="58673A16"/>
     <w:multiLevelType w:val="hybridMultilevel"/>
     <w:tmpl w:val="3A6EEB0E"/>
@@ -13406,7 +13536,7 @@
       </w:pPr>
     </w:lvl>
   </w:abstractNum>
-  <w:abstractNum w:abstractNumId="15" w15:restartNumberingAfterBreak="0">
+  <w:abstractNum w:abstractNumId="16" w15:restartNumberingAfterBreak="0">
     <w:nsid w:val="5C4634E3"/>
     <w:multiLevelType w:val="hybridMultilevel"/>
     <w:tmpl w:val="CDCEE07E"/>
@@ -13519,7 +13649,7 @@
       </w:rPr>
     </w:lvl>
   </w:abstractNum>
-  <w:abstractNum w:abstractNumId="16" w15:restartNumberingAfterBreak="0">
+  <w:abstractNum w:abstractNumId="17" w15:restartNumberingAfterBreak="0">
     <w:nsid w:val="66C14EEC"/>
     <w:multiLevelType w:val="hybridMultilevel"/>
     <w:tmpl w:val="9C561136"/>
@@ -13632,7 +13762,7 @@
       </w:rPr>
     </w:lvl>
   </w:abstractNum>
-  <w:abstractNum w:abstractNumId="17" w15:restartNumberingAfterBreak="0">
+  <w:abstractNum w:abstractNumId="18" w15:restartNumberingAfterBreak="0">
     <w:nsid w:val="74AE77F4"/>
     <w:multiLevelType w:val="hybridMultilevel"/>
     <w:tmpl w:val="E4EA6788"/>
@@ -13745,7 +13875,7 @@
       </w:rPr>
     </w:lvl>
   </w:abstractNum>
-  <w:abstractNum w:abstractNumId="18" w15:restartNumberingAfterBreak="0">
+  <w:abstractNum w:abstractNumId="19" w15:restartNumberingAfterBreak="0">
     <w:nsid w:val="794529D5"/>
     <w:multiLevelType w:val="hybridMultilevel"/>
     <w:tmpl w:val="E5A21522"/>
@@ -13858,7 +13988,7 @@
       </w:rPr>
     </w:lvl>
   </w:abstractNum>
-  <w:abstractNum w:abstractNumId="19" w15:restartNumberingAfterBreak="0">
+  <w:abstractNum w:abstractNumId="20" w15:restartNumberingAfterBreak="0">
     <w:nsid w:val="795C20C2"/>
     <w:multiLevelType w:val="hybridMultilevel"/>
     <w:tmpl w:val="CBFC2D40"/>
@@ -13945,6 +14075,118 @@
       <w:pPr>
         <w:ind w:left="6480" w:hanging="180"/>
       </w:pPr>
+    </w:lvl>
+  </w:abstractNum>
+  <w:abstractNum w:abstractNumId="21" w15:restartNumberingAfterBreak="0">
+    <w:nsid w:val="7DDE7374"/>
+    <w:multiLevelType w:val="hybridMultilevel"/>
+    <w:tmpl w:val="2604F00E"/>
+    <w:lvl w:ilvl="0" w:tplc="069ABE46">
+      <w:numFmt w:val="bullet"/>
+      <w:lvlText w:val="-"/>
+      <w:lvlJc w:val="left"/>
+      <w:pPr>
+        <w:ind w:left="720" w:hanging="360"/>
+      </w:pPr>
+      <w:rPr>
+        <w:rFonts w:ascii="Arial" w:eastAsia="Times New Roman" w:hAnsi="Arial" w:cs="Arial" w:hint="default"/>
+      </w:rPr>
+    </w:lvl>
+    <w:lvl w:ilvl="1" w:tplc="240A0003" w:tentative="1">
+      <w:start w:val="1"/>
+      <w:numFmt w:val="bullet"/>
+      <w:lvlText w:val="o"/>
+      <w:lvlJc w:val="left"/>
+      <w:pPr>
+        <w:ind w:left="1440" w:hanging="360"/>
+      </w:pPr>
+      <w:rPr>
+        <w:rFonts w:ascii="Courier New" w:hAnsi="Courier New" w:cs="Courier New" w:hint="default"/>
+      </w:rPr>
+    </w:lvl>
+    <w:lvl w:ilvl="2" w:tplc="240A0005" w:tentative="1">
+      <w:start w:val="1"/>
+      <w:numFmt w:val="bullet"/>
+      <w:lvlText w:val=""/>
+      <w:lvlJc w:val="left"/>
+      <w:pPr>
+        <w:ind w:left="2160" w:hanging="360"/>
+      </w:pPr>
+      <w:rPr>
+        <w:rFonts w:ascii="Wingdings" w:hAnsi="Wingdings" w:hint="default"/>
+      </w:rPr>
+    </w:lvl>
+    <w:lvl w:ilvl="3" w:tplc="240A0001" w:tentative="1">
+      <w:start w:val="1"/>
+      <w:numFmt w:val="bullet"/>
+      <w:lvlText w:val=""/>
+      <w:lvlJc w:val="left"/>
+      <w:pPr>
+        <w:ind w:left="2880" w:hanging="360"/>
+      </w:pPr>
+      <w:rPr>
+        <w:rFonts w:ascii="Symbol" w:hAnsi="Symbol" w:hint="default"/>
+      </w:rPr>
+    </w:lvl>
+    <w:lvl w:ilvl="4" w:tplc="240A0003" w:tentative="1">
+      <w:start w:val="1"/>
+      <w:numFmt w:val="bullet"/>
+      <w:lvlText w:val="o"/>
+      <w:lvlJc w:val="left"/>
+      <w:pPr>
+        <w:ind w:left="3600" w:hanging="360"/>
+      </w:pPr>
+      <w:rPr>
+        <w:rFonts w:ascii="Courier New" w:hAnsi="Courier New" w:cs="Courier New" w:hint="default"/>
+      </w:rPr>
+    </w:lvl>
+    <w:lvl w:ilvl="5" w:tplc="240A0005" w:tentative="1">
+      <w:start w:val="1"/>
+      <w:numFmt w:val="bullet"/>
+      <w:lvlText w:val=""/>
+      <w:lvlJc w:val="left"/>
+      <w:pPr>
+        <w:ind w:left="4320" w:hanging="360"/>
+      </w:pPr>
+      <w:rPr>
+        <w:rFonts w:ascii="Wingdings" w:hAnsi="Wingdings" w:hint="default"/>
+      </w:rPr>
+    </w:lvl>
+    <w:lvl w:ilvl="6" w:tplc="240A0001" w:tentative="1">
+      <w:start w:val="1"/>
+      <w:numFmt w:val="bullet"/>
+      <w:lvlText w:val=""/>
+      <w:lvlJc w:val="left"/>
+      <w:pPr>
+        <w:ind w:left="5040" w:hanging="360"/>
+      </w:pPr>
+      <w:rPr>
+        <w:rFonts w:ascii="Symbol" w:hAnsi="Symbol" w:hint="default"/>
+      </w:rPr>
+    </w:lvl>
+    <w:lvl w:ilvl="7" w:tplc="240A0003" w:tentative="1">
+      <w:start w:val="1"/>
+      <w:numFmt w:val="bullet"/>
+      <w:lvlText w:val="o"/>
+      <w:lvlJc w:val="left"/>
+      <w:pPr>
+        <w:ind w:left="5760" w:hanging="360"/>
+      </w:pPr>
+      <w:rPr>
+        <w:rFonts w:ascii="Courier New" w:hAnsi="Courier New" w:cs="Courier New" w:hint="default"/>
+      </w:rPr>
+    </w:lvl>
+    <w:lvl w:ilvl="8" w:tplc="240A0005" w:tentative="1">
+      <w:start w:val="1"/>
+      <w:numFmt w:val="bullet"/>
+      <w:lvlText w:val=""/>
+      <w:lvlJc w:val="left"/>
+      <w:pPr>
+        <w:ind w:left="6480" w:hanging="360"/>
+      </w:pPr>
+      <w:rPr>
+        <w:rFonts w:ascii="Wingdings" w:hAnsi="Wingdings" w:hint="default"/>
+      </w:rPr>
     </w:lvl>
   </w:abstractNum>
   <w:num w:numId="1" w16cid:durableId="1435517584">
@@ -13957,16 +14199,16 @@
     <w:abstractNumId w:val="1"/>
   </w:num>
   <w:num w:numId="4" w16cid:durableId="486366505">
-    <w:abstractNumId w:val="13"/>
+    <w:abstractNumId w:val="14"/>
   </w:num>
   <w:num w:numId="5" w16cid:durableId="1369602283">
-    <w:abstractNumId w:val="15"/>
+    <w:abstractNumId w:val="16"/>
   </w:num>
   <w:num w:numId="6" w16cid:durableId="1215968957">
     <w:abstractNumId w:val="5"/>
   </w:num>
   <w:num w:numId="7" w16cid:durableId="2146120390">
-    <w:abstractNumId w:val="18"/>
+    <w:abstractNumId w:val="19"/>
   </w:num>
   <w:num w:numId="8" w16cid:durableId="1489402372">
     <w:abstractNumId w:val="7"/>
@@ -13978,13 +14220,13 @@
     <w:abstractNumId w:val="6"/>
   </w:num>
   <w:num w:numId="11" w16cid:durableId="1177306036">
-    <w:abstractNumId w:val="11"/>
+    <w:abstractNumId w:val="12"/>
   </w:num>
   <w:num w:numId="12" w16cid:durableId="429006702">
-    <w:abstractNumId w:val="19"/>
+    <w:abstractNumId w:val="20"/>
   </w:num>
   <w:num w:numId="13" w16cid:durableId="213128077">
-    <w:abstractNumId w:val="14"/>
+    <w:abstractNumId w:val="15"/>
   </w:num>
   <w:num w:numId="14" w16cid:durableId="998001255">
     <w:abstractNumId w:val="9"/>
@@ -13993,7 +14235,7 @@
     <w:abstractNumId w:val="8"/>
   </w:num>
   <w:num w:numId="16" w16cid:durableId="1103913729">
-    <w:abstractNumId w:val="17"/>
+    <w:abstractNumId w:val="18"/>
   </w:num>
   <w:num w:numId="17" w16cid:durableId="1126696401">
     <w:abstractNumId w:val="3"/>
@@ -14002,10 +14244,16 @@
     <w:abstractNumId w:val="10"/>
   </w:num>
   <w:num w:numId="19" w16cid:durableId="193230898">
-    <w:abstractNumId w:val="16"/>
+    <w:abstractNumId w:val="17"/>
   </w:num>
   <w:num w:numId="20" w16cid:durableId="169495184">
-    <w:abstractNumId w:val="12"/>
+    <w:abstractNumId w:val="13"/>
+  </w:num>
+  <w:num w:numId="21" w16cid:durableId="735012783">
+    <w:abstractNumId w:val="21"/>
+  </w:num>
+  <w:num w:numId="22" w16cid:durableId="1571887305">
+    <w:abstractNumId w:val="11"/>
   </w:num>
   <w:numIdMacAtCleanup w:val="1"/>
 </w:numbering>

</xml_diff>